<commit_message>
TNNLS: add conflicts-of-interest section and Title Page acknowledgments
- main tex/pdf: anonymous-safe COI statement required by the portal
  ('must be disclosed within your manuscript')
- named camera-ready backup: same COI section
- Title Page: add Acknowledgments (portal-required field)
  with truthful NWPU-support line (no fabricated grants/placeholders)
- regenerate source zip with updated tex
</commit_message>
<xml_diff>
--- a/paper/TNNLS/TNNLS_TitlePage.docx
+++ b/paper/TNNLS/TNNLS_TitlePage.docx
@@ -111,6 +111,27 @@
         <w:t xml:space="preserve">e-mail: raihan@mail.nwpu.edu.cn</w:t>
       </w:r>
     </w:p>
+    <w:p>
+      <w:pPr>
+        <w:spacing w:before="120" w:after="120"/>
+      </w:pPr>
+      <w:r>
+        <w:rPr>
+          <w:b/>
+          <w:sz w:val="24"/>
+          <w:szCs w:val="24"/>
+        </w:rPr>
+        <w:t xml:space="preserve">Acknowledgments</w:t>
+      </w:r>
+    </w:p>
+    <w:p>
+      <w:pPr>
+        <w:spacing w:before="0" w:after="120"/>
+      </w:pPr>
+      <w:r>
+        <w:t xml:space="preserve">The authors thank Northwestern Polytechnical University for supporting this research.</w:t>
+      </w:r>
+    </w:p>
     <w:sectPr>
       <w:pgSz w:w="12240" w:h="15840"/>
       <w:pgMar w:top="1440" w:right="1440" w:bottom="1440" w:left="1440" w:header="720" w:footer="720" w:gutter="0"/>

</xml_diff>